<commit_message>
Refine copy scripts for three videos
</commit_message>
<xml_diff>
--- a/deliverables/暮言/复制脚本.docx
+++ b/deliverables/暮言/复制脚本.docx
@@ -7,492 +7,753 @@
         <w:pStyle w:val="Title"/>
       </w:pPr>
       <w:r>
+        <w:t>如果还能再陪奶奶一次</w:t>
+      </w:r>
+    </w:p>
+    <w:p>
+      <w:r>
         <w:t>剧名：《如果还能再陪奶奶一次》</w:t>
       </w:r>
     </w:p>
     <w:p>
-      <w:pPr>
-        <w:pStyle w:val="Heading1"/>
-      </w:pPr>
       <w:r>
-        <w:t>整体剧情概括</w:t>
+        <w:t>整体剧情概括：</w:t>
+      </w:r>
+      <w:r>
+        <w:br/>
+      </w:r>
+      <w:r>
+        <w:t>这条视频的强度不只来自“穿越见奶奶”这个设定，更来自它把原本已经来不及做的关心，一件一件补回去。主角像是误打误撞回到小时候，先遇见童年时期的自己，再一路借着买零食、回家吃饭、陪奶奶说话、给钱、提醒做检查这些动作，把成年后才懂的亏欠全都补给过去。整条视频的台词密度并不低，前半段是连续逗趣和确认身份，中段是奶奶与孙子之间非常生活化的饭桌对白，后段则突然转成最直白的迟到孝顺和不舍。真正打人的地方，是这些台词都不悬浮，而是句句都像现实里来不及补上的话。</w:t>
       </w:r>
     </w:p>
     <w:p>
       <w:r>
-        <w:t>这条视频不是简单的“回忆奶奶”，而是把“穿回过去重新见奶奶一面”的幻想拍成了具体旅程。主角先在乡间小路上遇到孩童时代的家人线索，再借买零食、回家吃饭、塞钱叮嘱体检这些日常动作，把他对奶奶的亏欠一点点补回去。真正打人的地方不在穿越设定本身，而在他明知道这一切留不住，还是拼命把现在才懂得的关心补给过去的人，最后落到“求你别离开我，因为我欠你太多”的情绪明牌。</w:t>
-      </w:r>
-    </w:p>
-    <w:p>
-      <w:pPr>
-        <w:pStyle w:val="Heading1"/>
-      </w:pPr>
-      <w:r>
-        <w:t>第一集：穿回去再见奶奶一面</w:t>
-      </w:r>
-    </w:p>
-    <w:p>
-      <w:pPr>
-        <w:pStyle w:val="Heading2"/>
-      </w:pPr>
-      <w:r>
-        <w:t>1-1 日/内外 建立设定</w:t>
+        <w:t>第一集：穿回去，再陪奶奶一顿饭</w:t>
       </w:r>
     </w:p>
     <w:p>
       <w:r>
-        <w:t>△ 时间：00:00-00:25</w:t>
+        <w:t>1-1 日 外 乡间土路初醒</w:t>
+      </w:r>
+      <w:r>
+        <w:br/>
+      </w:r>
+      <w:r>
+        <w:t>△ 时间：00:00-00:15</w:t>
+      </w:r>
+      <w:r>
+        <w:br/>
+      </w:r>
+      <w:r>
+        <w:t>△ 画面从模糊和晃动开始，像是主角突然从现实里跌进另一个时间层。</w:t>
+      </w:r>
+      <w:r>
+        <w:br/>
+      </w:r>
+      <w:r>
+        <w:t>△ 一个小男孩把他叫醒，语气天然、熟络，又带着孩子对陌生人的警惕。</w:t>
+      </w:r>
+      <w:r>
+        <w:br/>
+      </w:r>
+      <w:r>
+        <w:t>△ 主角第一反应不是问路，而是被眼前这张熟悉的小脸击中，意识到自己像是回到了过去。</w:t>
+      </w:r>
+      <w:r>
+        <w:br/>
+      </w:r>
+      <w:r>
+        <w:t>对白拆解：</w:t>
+      </w:r>
+      <w:r>
+        <w:br/>
+      </w:r>
+      <w:r>
+        <w:t>主角：哎，醒醒，快醒醒……</w:t>
+      </w:r>
+      <w:r>
+        <w:br/>
+      </w:r>
+      <w:r>
+        <w:t>小男孩：你怎麼了？</w:t>
+      </w:r>
+      <w:r>
+        <w:br/>
+      </w:r>
+      <w:r>
+        <w:t>主角（愣住）：這不是小時候的我嗎？</w:t>
+      </w:r>
+      <w:r>
+        <w:br/>
+      </w:r>
+      <w:r>
+        <w:t>主角（慌乱看四周）：我怎麼會在這？難道我穿越了？</w:t>
+      </w:r>
+      <w:r>
+        <w:br/>
+      </w:r>
+      <w:r>
+        <w:t>小男孩：咋樣，還暈不？</w:t>
+      </w:r>
+      <w:r>
+        <w:br/>
+      </w:r>
+      <w:r>
+        <w:t>主角：好多嘞，謝謝你。</w:t>
       </w:r>
     </w:p>
     <w:p>
       <w:r>
-        <w:t>△ 镜头从模糊的近景起步，主角像是刚从昏沉中醒来，随后在乡间土路边看见一个小男孩，画面迅速建立出“误入旧时空”的第一印象。</w:t>
+        <w:t>1-2 日 外 路边试探相认</w:t>
+      </w:r>
+      <w:r>
+        <w:br/>
+      </w:r>
+      <w:r>
+        <w:t>△ 时间：00:15-00:32</w:t>
+      </w:r>
+      <w:r>
+        <w:br/>
+      </w:r>
+      <w:r>
+        <w:t>△ 主角压住情绪，开始试探这个孩子；孩子也在反过来打量他。</w:t>
+      </w:r>
+      <w:r>
+        <w:br/>
+      </w:r>
+      <w:r>
+        <w:t>△ 这一段的台词很重要，因为它不是立刻煽情，而是先把“陌生大人”和“熟悉血缘感”之间的试探铺出来。</w:t>
+      </w:r>
+      <w:r>
+        <w:br/>
+      </w:r>
+      <w:r>
+        <w:t>对白拆解：</w:t>
+      </w:r>
+      <w:r>
+        <w:br/>
+      </w:r>
+      <w:r>
+        <w:t>主角：沒事……你是不是俺家親戚啊？</w:t>
+      </w:r>
+      <w:r>
+        <w:br/>
+      </w:r>
+      <w:r>
+        <w:t>小男孩：你咋知道嘞？</w:t>
+      </w:r>
+      <w:r>
+        <w:br/>
+      </w:r>
+      <w:r>
+        <w:t>主角：因為你跟俺爸長得可像。</w:t>
+      </w:r>
+      <w:r>
+        <w:br/>
+      </w:r>
+      <w:r>
+        <w:t>小男孩（笑起来）：哈哈哈哈。</w:t>
+      </w:r>
+      <w:r>
+        <w:br/>
+      </w:r>
+      <w:r>
+        <w:t>主角：來，俺倆算是朋友吧？</w:t>
+      </w:r>
+      <w:r>
+        <w:br/>
+      </w:r>
+      <w:r>
+        <w:t>小男孩：咱俩算是朋友吧？</w:t>
+      </w:r>
+      <w:r>
+        <w:br/>
+      </w:r>
+      <w:r>
+        <w:t>主角：就见过几次面。</w:t>
+      </w:r>
+      <w:r>
+        <w:br/>
+      </w:r>
+      <w:r>
+        <w:t>小男孩：我也是，就见过他几次。</w:t>
       </w:r>
     </w:p>
     <w:p>
       <w:r>
-        <w:t>△ 从醒来、发懵，到和小男孩搭上话，确认自己似乎进入了一个不属于现在的时间现场。</w:t>
+        <w:t>1-3 日 外 小卖部前套话</w:t>
+      </w:r>
+      <w:r>
+        <w:br/>
+      </w:r>
+      <w:r>
+        <w:t>△ 时间：00:32-00:50</w:t>
+      </w:r>
+      <w:r>
+        <w:br/>
+      </w:r>
+      <w:r>
+        <w:t>△ 主角顺着“朋友”的关系往下接，开始打听孩子家里人什么时候回来。</w:t>
+      </w:r>
+      <w:r>
+        <w:br/>
+      </w:r>
+      <w:r>
+        <w:t>△ 同时，他把孩子手里的小纸片、零食信息接住，让这场重逢变得像一次童年愿望实现。</w:t>
+      </w:r>
+      <w:r>
+        <w:br/>
+      </w:r>
+      <w:r>
+        <w:t>对白拆解：</w:t>
+      </w:r>
+      <w:r>
+        <w:br/>
+      </w:r>
+      <w:r>
+        <w:t>主角：那你知道他什么时候回来吗？</w:t>
+      </w:r>
+      <w:r>
+        <w:br/>
+      </w:r>
+      <w:r>
+        <w:t>小男孩：他……他过年就回来了。</w:t>
+      </w:r>
+      <w:r>
+        <w:br/>
+      </w:r>
+      <w:r>
+        <w:t>主角：哎，你这是啥呀？</w:t>
+      </w:r>
+      <w:r>
+        <w:br/>
+      </w:r>
+      <w:r>
+        <w:t>小男孩：路上捡了只，这上面有可多好吃的呀。</w:t>
+      </w:r>
+      <w:r>
+        <w:br/>
+      </w:r>
+      <w:r>
+        <w:t>主角：是吗？</w:t>
+      </w:r>
+      <w:r>
+        <w:br/>
+      </w:r>
+      <w:r>
+        <w:t>小男孩：对呀，那一面还有玩具。</w:t>
+      </w:r>
+      <w:r>
+        <w:br/>
+      </w:r>
+      <w:r>
+        <w:t>主角：你要红山帽不？我给你买一个。</w:t>
+      </w:r>
+      <w:r>
+        <w:br/>
+      </w:r>
+      <w:r>
+        <w:t>小男孩：不要。</w:t>
       </w:r>
     </w:p>
     <w:p>
       <w:r>
-        <w:t>△ 主角先是惊醒，紧接着对眼前的小男孩和环境产生强烈错位感，直接说出“这不是小时候的我吗”“难道我穿越了”，把整条视频的幻想前提立起来。</w:t>
+        <w:t>1-4 日 外 小卖部买零食与玩具</w:t>
+      </w:r>
+      <w:r>
+        <w:br/>
+      </w:r>
+      <w:r>
+        <w:t>△ 时间：00:50-01:15</w:t>
+      </w:r>
+      <w:r>
+        <w:br/>
+      </w:r>
+      <w:r>
+        <w:t>△ 这是前半段最有烟火气的一场戏。主角像一个提前知道答案的人，把孩子所有舍不得说出口的小愿望一口气点出来。</w:t>
+      </w:r>
+      <w:r>
+        <w:br/>
+      </w:r>
+      <w:r>
+        <w:t>△ 这段对白密度很高，也最能说明“他真的认识这个孩子”。</w:t>
+      </w:r>
+      <w:r>
+        <w:br/>
+      </w:r>
+      <w:r>
+        <w:t>对白拆解：</w:t>
+      </w:r>
+      <w:r>
+        <w:br/>
+      </w:r>
+      <w:r>
+        <w:t>主角：不要？我跟咱爸是朋友，我不骗你。走吧。</w:t>
+      </w:r>
+      <w:r>
+        <w:br/>
+      </w:r>
+      <w:r>
+        <w:t>主角（对店家）：那个带风扇的帽子给我拿一个吧。</w:t>
+      </w:r>
+      <w:r>
+        <w:br/>
+      </w:r>
+      <w:r>
+        <w:t>主角：还有那个悠悠球、赛车，再给我拿两包方便面，拿瓶可乐，棒棒糖拿个十五个。</w:t>
+      </w:r>
+      <w:r>
+        <w:br/>
+      </w:r>
+      <w:r>
+        <w:t>小男孩（震惊）：你咋知道我想要这些？</w:t>
+      </w:r>
+      <w:r>
+        <w:br/>
+      </w:r>
+      <w:r>
+        <w:t>主角：那肯定了，我可是世界上最了解你的人。</w:t>
+      </w:r>
+      <w:r>
+        <w:br/>
+      </w:r>
+      <w:r>
+        <w:t>主角：厉害吧？</w:t>
+      </w:r>
+      <w:r>
+        <w:br/>
+      </w:r>
+      <w:r>
+        <w:t>小男孩：厉害。</w:t>
+      </w:r>
+      <w:r>
+        <w:br/>
+      </w:r>
+      <w:r>
+        <w:t>小男孩：但俺奶奶比你厉害。</w:t>
+      </w:r>
+      <w:r>
+        <w:br/>
+      </w:r>
+      <w:r>
+        <w:t>主角：是吗？</w:t>
+      </w:r>
+      <w:r>
+        <w:br/>
+      </w:r>
+      <w:r>
+        <w:t>小男孩：她会魔法。</w:t>
       </w:r>
     </w:p>
     <w:p>
       <w:r>
-        <w:t>旁白/对白：哎醒醒快醒醒你怎麼了 這不是小時候的我嗎 我怎麼會在這 難道我穿越了 咋樣還暈不 好多嘞謝謝你 沒事你你是不是俺家親戚啊 你咋知道嘞 因為你跟俺爸長得可像 哈哈哈哈 來俺倆算是朋友吧</w:t>
+        <w:t>1-5 日 外进内 回家见奶奶</w:t>
       </w:r>
-    </w:p>
-    <w:p/>
-    <w:p>
-      <w:pPr>
-        <w:pStyle w:val="Heading2"/>
-      </w:pPr>
       <w:r>
-        <w:t>2-2 日/内外 关系升温</w:t>
+        <w:br/>
+      </w:r>
+      <w:r>
+        <w:t>△ 时间：01:15-01:40</w:t>
+      </w:r>
+      <w:r>
+        <w:br/>
+      </w:r>
+      <w:r>
+        <w:t>△ 孩子把主角带回旧屋，奶奶正式出场。视频到这里才真正亮出核心人物。</w:t>
+      </w:r>
+      <w:r>
+        <w:br/>
+      </w:r>
+      <w:r>
+        <w:t>△ 奶奶的台词很生活，不是煽情路线，而是带着老人家嫌孩子乱跑、又顺手照顾人的日常口气。</w:t>
+      </w:r>
+      <w:r>
+        <w:br/>
+      </w:r>
+      <w:r>
+        <w:t>对白拆解：</w:t>
+      </w:r>
+      <w:r>
+        <w:br/>
+      </w:r>
+      <w:r>
+        <w:t>小男孩：奶奶，我回来了，奶奶！</w:t>
+      </w:r>
+      <w:r>
+        <w:br/>
+      </w:r>
+      <w:r>
+        <w:t>奶奶：你又跑哪儿去了？</w:t>
+      </w:r>
+      <w:r>
+        <w:br/>
+      </w:r>
+      <w:r>
+        <w:t>小男孩：你不是会魔法吗？它不知道我去哪儿了。</w:t>
+      </w:r>
+      <w:r>
+        <w:br/>
+      </w:r>
+      <w:r>
+        <w:t>奶奶：魔法个屁，赶紧去换换衣裳。</w:t>
+      </w:r>
+      <w:r>
+        <w:br/>
+      </w:r>
+      <w:r>
+        <w:t>主角（顺势接话）：你看，我也会魔法。</w:t>
+      </w:r>
+      <w:r>
+        <w:br/>
+      </w:r>
+      <w:r>
+        <w:t>奶奶：这谁给你买的呀？</w:t>
+      </w:r>
+      <w:r>
+        <w:br/>
+      </w:r>
+      <w:r>
+        <w:t>小男孩：奶奶，奶奶……</w:t>
+      </w:r>
+      <w:r>
+        <w:br/>
+      </w:r>
+      <w:r>
+        <w:t>奶奶：赶紧进屋吧，进屋，我去做饭。</w:t>
+      </w:r>
+      <w:r>
+        <w:br/>
+      </w:r>
+      <w:r>
+        <w:t>△ 这一段最妙的是，主角终于进了那个他真正想回去的家，但所有人都还把这当成最平常的一天。</w:t>
       </w:r>
     </w:p>
     <w:p>
       <w:r>
-        <w:t>△ 时间：00:23-00:50</w:t>
+        <w:t>1-6 日 内 饭桌重逢</w:t>
+      </w:r>
+      <w:r>
+        <w:br/>
+      </w:r>
+      <w:r>
+        <w:t>△ 时间：01:40-02:05</w:t>
+      </w:r>
+      <w:r>
+        <w:br/>
+      </w:r>
+      <w:r>
+        <w:t>△ 饭桌戏是整条视频最扎实的一段。菜端上来，主角开始一边吃，一边把“熟悉的味道”和失去后的想念对上号。</w:t>
+      </w:r>
+      <w:r>
+        <w:br/>
+      </w:r>
+      <w:r>
+        <w:t>△ 这里台词看似碎，其实句句都很有层次：先夸菜，再被奶奶察觉情绪，再说出“我有点想奶了”。</w:t>
+      </w:r>
+      <w:r>
+        <w:br/>
+      </w:r>
+      <w:r>
+        <w:t>对白拆解：</w:t>
+      </w:r>
+      <w:r>
+        <w:br/>
+      </w:r>
+      <w:r>
+        <w:t>主角：你炒的三明烧肉可好吃，你尝尝。</w:t>
+      </w:r>
+      <w:r>
+        <w:br/>
+      </w:r>
+      <w:r>
+        <w:t>奶奶：我专门炒的，你多吃点。</w:t>
+      </w:r>
+      <w:r>
+        <w:br/>
+      </w:r>
+      <w:r>
+        <w:t>主角：好好好，我自己倒就中。</w:t>
+      </w:r>
+      <w:r>
+        <w:br/>
+      </w:r>
+      <w:r>
+        <w:t>奶奶：说啥呀，孩儿，菜不好吃吗？</w:t>
+      </w:r>
+      <w:r>
+        <w:br/>
+      </w:r>
+      <w:r>
+        <w:t>主角：好吃，跟奶做的味儿一样。</w:t>
+      </w:r>
+      <w:r>
+        <w:br/>
+      </w:r>
+      <w:r>
+        <w:t>主角（声音发紧）：我吃了，我有点想奶了。</w:t>
+      </w:r>
+      <w:r>
+        <w:br/>
+      </w:r>
+      <w:r>
+        <w:t>奶奶：那你以后常来，我给你做。</w:t>
+      </w:r>
+      <w:r>
+        <w:br/>
+      </w:r>
+      <w:r>
+        <w:t>主角：嗯，我一定常来看你。</w:t>
+      </w:r>
+      <w:r>
+        <w:br/>
+      </w:r>
+      <w:r>
+        <w:t>△ 这时视频已经从“奇遇”彻底走到“补偿”，只是主角还不敢一下说破。</w:t>
       </w:r>
     </w:p>
     <w:p>
       <w:r>
-        <w:t>△ 小男孩坐在土路边，手里拿着零食包装和小卖部菜单一类的纸张，画面氛围轻松，像是大人正在陪孩子完成一点小小愿望。</w:t>
+        <w:t>1-7 日 内 迟到的叮嘱和塞钱</w:t>
+      </w:r>
+      <w:r>
+        <w:br/>
+      </w:r>
+      <w:r>
+        <w:t>△ 时间：02:05-02:30</w:t>
+      </w:r>
+      <w:r>
+        <w:br/>
+      </w:r>
+      <w:r>
+        <w:t>△ 后半段最重的不是哭，而是主角突然开始说成年人该说的话：做脑CT、拿着钱、买点好吃的、你瘦了。</w:t>
+      </w:r>
+      <w:r>
+        <w:br/>
+      </w:r>
+      <w:r>
+        <w:t>△ 这些台词一下把主角从“回到过去的孩子”拉回“现实里已经来不及照顾奶奶的大人”。</w:t>
+      </w:r>
+      <w:r>
+        <w:br/>
+      </w:r>
+      <w:r>
+        <w:t>对白拆解：</w:t>
+      </w:r>
+      <w:r>
+        <w:br/>
+      </w:r>
+      <w:r>
+        <w:t>主角：奶奶，你一定记得每年都得去排脑CT。</w:t>
+      </w:r>
+      <w:r>
+        <w:br/>
+      </w:r>
+      <w:r>
+        <w:t>主角：这钱给你，你拿着。</w:t>
+      </w:r>
+      <w:r>
+        <w:br/>
+      </w:r>
+      <w:r>
+        <w:t>奶奶：不用。</w:t>
+      </w:r>
+      <w:r>
+        <w:br/>
+      </w:r>
+      <w:r>
+        <w:t>主角：拿着吧，拿着买点好吃的。</w:t>
+      </w:r>
+      <w:r>
+        <w:br/>
+      </w:r>
+      <w:r>
+        <w:t>主角：你看你现在瘦了。</w:t>
+      </w:r>
+      <w:r>
+        <w:br/>
+      </w:r>
+      <w:r>
+        <w:t>奶奶：我这体质，吃不胖，你留着吧。</w:t>
+      </w:r>
+      <w:r>
+        <w:br/>
+      </w:r>
+      <w:r>
+        <w:t>主角：跟着我的时候哪有真瘦啊……长大，莫少吃苦吧。</w:t>
+      </w:r>
+      <w:r>
+        <w:br/>
+      </w:r>
+      <w:r>
+        <w:t>主角（几乎要绷不住）：你认识我？</w:t>
+      </w:r>
+      <w:r>
+        <w:br/>
+      </w:r>
+      <w:r>
+        <w:t>奶奶：傻孩子，我有魔法你忘了吗？哪有奶奶不认识自己孙子的。</w:t>
+      </w:r>
+      <w:r>
+        <w:br/>
+      </w:r>
+      <w:r>
+        <w:t>主角：奶奶……</w:t>
+      </w:r>
+      <w:r>
+        <w:br/>
+      </w:r>
+      <w:r>
+        <w:t>△ 到这里，视频真正的刀子才落下来。奶奶认出他，不是因为超自然，而是因为“奶奶本来就认得自己的孙子”。</w:t>
       </w:r>
     </w:p>
     <w:p>
       <w:r>
-        <w:t>△ 从聊天试探过渡到买东西和哄孩子，通过满足孩子的口腹之欲与玩具欲建立信任。</w:t>
+        <w:t>1-8 日 内外 情绪收口</w:t>
+      </w:r>
+      <w:r>
+        <w:br/>
+      </w:r>
+      <w:r>
+        <w:t>△ 时间：02:30-02:42</w:t>
+      </w:r>
+      <w:r>
+        <w:br/>
+      </w:r>
+      <w:r>
+        <w:t>△ 热闹和对白突然撤掉，只剩最后一句像祈求一样的明牌。</w:t>
+      </w:r>
+      <w:r>
+        <w:br/>
+      </w:r>
+      <w:r>
+        <w:t>△ 前面所有零食、饭菜、叮嘱、塞钱，到这里全都变成一句话的注脚。</w:t>
+      </w:r>
+      <w:r>
+        <w:br/>
+      </w:r>
+      <w:r>
+        <w:t>旁白/对白：求你别离开我，因为我欠你太多。</w:t>
+      </w:r>
+      <w:r>
+        <w:br/>
+      </w:r>
+      <w:r>
+        <w:t>△ 这句不是突兀煽情，而是把前面没说透的东西一次性点穿：他不是来冒险的，他是来补课的。</w:t>
       </w:r>
     </w:p>
     <w:p>
       <w:r>
-        <w:t>△ 主角顺着“朋友”关系往前推进，问他家里人什么时候回来，又借零食和玩具快速拉近距离，让这段穿越不再只是陌生奇遇，而像一场早就熟悉的重逢。</w:t>
+        <w:t>【角色分析】</w:t>
+      </w:r>
+      <w:r>
+        <w:br/>
+      </w:r>
+      <w:r>
+        <w:t>• 主角：前半段像个会逗孩子的外来人，中段像久别重逢的孙子，后段完全变成一个想把亏欠往回补的大人。</w:t>
+      </w:r>
+      <w:r>
+        <w:br/>
+      </w:r>
+      <w:r>
+        <w:t>• 小男孩：既是童年时空入口，也是“过去的自己”的镜面，让主角有机会重新走回奶奶身边。</w:t>
+      </w:r>
+      <w:r>
+        <w:br/>
+      </w:r>
+      <w:r>
+        <w:t>• 奶奶：她所有台词都很家常，正因为平常，才更有杀伤力。她不是做大道理的人，她只是在做饭、招呼人、推钱、认出孙子。</w:t>
       </w:r>
     </w:p>
     <w:p>
       <w:r>
-        <w:t>旁白/对白：咱俩算是朋友吧 就见过几次面 我也是就见过他几次 那你知道他什么时候回来吗 他 他过年就回来了 哎你这是啥呀 路上捡了只这上面有可多好吃的呀 是吗对呀 那一面还有玩具 你要红山帽不 我给你买一个 不要</w:t>
+        <w:t>【教育意义/文化价值】</w:t>
       </w:r>
-    </w:p>
-    <w:p/>
-    <w:p>
-      <w:pPr>
-        <w:pStyle w:val="Heading2"/>
-      </w:pPr>
       <w:r>
-        <w:t>3-3 日/内外 童年欲望满足</w:t>
+        <w:br/>
+      </w:r>
+      <w:r>
+        <w:t>• 原片最强的地方，是把“孝顺来不及”拆成一连串具体动作，而不是一句抽象后悔。</w:t>
+      </w:r>
+      <w:r>
+        <w:br/>
+      </w:r>
+      <w:r>
+        <w:t>• 小卖部、旧屋、饭桌、家常菜这些元素带着非常强的中国家庭记忆感，容易形成跨代共鸣。</w:t>
+      </w:r>
+      <w:r>
+        <w:br/>
+      </w:r>
+      <w:r>
+        <w:t>• 台词密度高但不吵，每一句都落在关系推进上，适合当作温情短剧对白节奏的母本。</w:t>
       </w:r>
     </w:p>
     <w:p>
       <w:r>
-        <w:t>△ 时间：00:48-01:15</w:t>
+        <w:t>【核心爆点】</w:t>
+      </w:r>
+      <w:r>
+        <w:br/>
+      </w:r>
+      <w:r>
+        <w:t>• 用穿越外壳包裹失去后的补偿心理。</w:t>
+      </w:r>
+      <w:r>
+        <w:br/>
+      </w:r>
+      <w:r>
+        <w:t>• 通过买零食、陪吃饭、塞钱、催体检这些小动作不断加深亏欠感。</w:t>
+      </w:r>
+      <w:r>
+        <w:br/>
+      </w:r>
+      <w:r>
+        <w:t>• 最后一句“因为我欠你太多”让前面的所有热闹瞬间反刺回现实。</w:t>
       </w:r>
     </w:p>
     <w:p>
       <w:r>
-        <w:t>△ 画面继续围绕孩子、零食和乡村道路展开，随后人物开始移动，像是买完东西后一起往家里走，故事重心从“遇见”转向“带他回家”。</w:t>
-      </w:r>
-    </w:p>
-    <w:p>
-      <w:r>
-        <w:t>△ 主角不断报出孩子想要的东西，满足愿望后与他一起动身去见更重要的家人。</w:t>
-      </w:r>
-    </w:p>
-    <w:p>
-      <w:r>
-        <w:t>△ 主角准确说中孩子想要的零食和玩具，还自称“世界上最了解你的人”，这让前面的穿越设定第一次变得有情感重量，因为他知道的不只是路，而是这个孩子心里最细碎的愿望。</w:t>
-      </w:r>
-    </w:p>
-    <w:p>
-      <w:r>
-        <w:t>旁白/对白：不要 我跟咱爸是朋友我不骗你 走吧 那个带风扇的帽子给我拿一个吧 还有那个悠悠球 赛车 再给我拿两包方便面 拿瓶可乐 棒棒糖拿个15个 你咋知道我想要这些 那肯定了 我可是世界上最了解你的人 厉害吧 厉害 但俺奶奶比你厉害 是吗 她会魔法</w:t>
-      </w:r>
-    </w:p>
-    <w:p/>
-    <w:p>
-      <w:pPr>
-        <w:pStyle w:val="Heading2"/>
-      </w:pPr>
-      <w:r>
-        <w:t>4-4 日/内外 奶奶出场</w:t>
-      </w:r>
-    </w:p>
-    <w:p>
-      <w:r>
-        <w:t>△ 时间：01:13-01:40</w:t>
-      </w:r>
-    </w:p>
-    <w:p>
-      <w:r>
-        <w:t>△ 人物从户外回到老砖房与院落，年迈女性正式进入画面，空间一下从外部道路切换成充满生活痕迹的旧家。</w:t>
-      </w:r>
-    </w:p>
-    <w:p>
-      <w:r>
-        <w:t>△ 孩子回家喊奶奶，主角顺势进屋，奶奶一边招呼一边准备做饭，家庭日常被重新点亮。</w:t>
-      </w:r>
-    </w:p>
-    <w:p>
-      <w:r>
-        <w:t>△ 奶奶出场后，视频真正找到了情感核心。前面那些零食和玩具是铺垫，这一段开始，主角终于进入自己真正想见的人和地方。</w:t>
-      </w:r>
-    </w:p>
-    <w:p>
-      <w:r>
-        <w:t>旁白/对白：那是厉害 奶奶我回来了奶奶 你又跑哪儿去了 你不是会魔法吗 它不知道我去哪儿了 魔法个屁 赶紧去换换衣裳 你看我也会魔法 这谁给你买的呀 奶奶 奶奶 赶紧进屋吧 进屋 我去做饭 奶奶上面穿手铐</w:t>
-      </w:r>
-    </w:p>
-    <w:p/>
-    <w:p>
-      <w:pPr>
-        <w:pStyle w:val="Heading2"/>
-      </w:pPr>
-      <w:r>
-        <w:t>5-5 日/内外 温情补偿</w:t>
-      </w:r>
-    </w:p>
-    <w:p>
-      <w:r>
-        <w:t>△ 时间：01:38-02:05</w:t>
-      </w:r>
-    </w:p>
-    <w:p>
-      <w:r>
-        <w:t>△ 桌上饭菜、奶奶端菜和主角坐在屋里吃饭的画面成为主体，家常饭桌把整条视频从奇遇拉回到最朴素也最伤人的亲情现场。</w:t>
-      </w:r>
-    </w:p>
-    <w:p>
-      <w:r>
-        <w:t>△ 奶奶做饭、端菜，主角边吃边夸味道，情绪从兴奋慢慢转成舍不得。</w:t>
-      </w:r>
-    </w:p>
-    <w:p>
-      <w:r>
-        <w:t>△ 主角一边吃一边不断把眼前的味道与记忆中的奶奶绑定起来。这段最重要的不是“饭菜好吃”，而是他终于有机会重新坐在奶奶面前，把怀念从心里变成眼前。</w:t>
-      </w:r>
-    </w:p>
-    <w:p>
-      <w:r>
-        <w:t>旁白/对白：你炒的三明烧肉可好吃,你尝尝 我专门炒的,你多吃点 好好好,我自己倒就中 说啥呀,孩儿,菜不好吃吗? 好吃,跟奶做的味儿一样,我吃了我有点想奶了 那你以后常来,我给你做 嗯,我一定常来看你 我走了奶,你一定记得每天</w:t>
-      </w:r>
-    </w:p>
-    <w:p/>
-    <w:p>
-      <w:pPr>
-        <w:pStyle w:val="Heading2"/>
-      </w:pPr>
-      <w:r>
-        <w:t>6-6 日/内外 情感明牌</w:t>
-      </w:r>
-    </w:p>
-    <w:p>
-      <w:r>
-        <w:t>△ 时间：02:03-02:30</w:t>
-      </w:r>
-    </w:p>
-    <w:p>
-      <w:r>
-        <w:t>△ 镜头仍停留在奶奶和饭桌空间里，主角开始把“照顾身体”“拿钱买吃的”这些成年人视角的关心直接说出口，叙事由温暖过渡到补偿。</w:t>
-      </w:r>
-    </w:p>
-    <w:p>
-      <w:r>
-        <w:t>△ 主角给钱、叮嘱做脑CT、关心奶奶身体，奶奶则一边推辞一边接住这份笨拙的爱。</w:t>
-      </w:r>
-    </w:p>
-    <w:p>
-      <w:r>
-        <w:t>△ 这一段最扎心的点在于主角不再满足于“陪你吃顿饭”，而是开始把现实里没来得及做的责任往回补：提醒体检、塞钱、说你瘦了、怕你再吃苦。这些话不是普通寒暄，而是迟到的孝顺。</w:t>
-      </w:r>
-    </w:p>
-    <w:p>
-      <w:r>
-        <w:t>旁白/对白：奶奶,你一定记得每年都得去排脑CT 这钱给你,你拿着 不用 拿着吧,拿着买点好吃的 你看你现在瘦了 我这体质吃不胖,你留着吧 跟着我的时候哪有真瘦啊 长大,莫少吃苦吧 你认识我 傻孩子,我有魔法你忘了吗 哪有奶奶不认识自己孙子的 奶奶</w:t>
-      </w:r>
-    </w:p>
-    <w:p/>
-    <w:p>
-      <w:pPr>
-        <w:pStyle w:val="Heading2"/>
-      </w:pPr>
-      <w:r>
-        <w:t>7-7 日/内外 收尾</w:t>
-      </w:r>
-    </w:p>
-    <w:p>
-      <w:r>
-        <w:t>△ 时间：02:28-02:42</w:t>
-      </w:r>
-    </w:p>
-    <w:p>
-      <w:r>
-        <w:t>△ 热闹的人物互动撤掉后，画面转向更空、更静的现实质感，最后用一句近乎哀求的字幕/旁白把前面的补偿幻想全部压回失去。</w:t>
-      </w:r>
-    </w:p>
-    <w:p>
-      <w:r>
-        <w:t>△ 从陪伴场景切回失去后的现实感受，以一句直白自责完成情绪闭环。</w:t>
-      </w:r>
-    </w:p>
-    <w:p>
-      <w:r>
-        <w:t>△ 结尾不再继续讲故事，而是把整条视频的真实动机摊开：主角之所以想穿回去，不过是因为现实里已经见不到奶奶了，所以才会在想象里一遍遍重演“如果我还能再陪你一次”。</w:t>
-      </w:r>
-    </w:p>
-    <w:p>
-      <w:r>
-        <w:t>旁白/对白：求你别离开我 因为我欠你太多</w:t>
-      </w:r>
-    </w:p>
-    <w:p/>
-    <w:p>
-      <w:pPr>
-        <w:pStyle w:val="Heading1"/>
-      </w:pPr>
-      <w:r>
-        <w:t>【角色分析】</w:t>
-      </w:r>
-    </w:p>
-    <w:p>
-      <w:pPr>
-        <w:pStyle w:val="ListBullet"/>
-      </w:pPr>
-      <w:r>
-        <w:t>• 主角：成年后带着亏欠感重新进入童年现场，所有行动都带着“补偿来不及说出口的爱”的目的。</w:t>
-      </w:r>
-    </w:p>
-    <w:p>
-      <w:pPr>
-        <w:pStyle w:val="ListBullet"/>
-      </w:pPr>
-      <w:r>
-        <w:t>• 童年线索人物（小男孩）：承担“把主角重新带回旧时空”的入口作用，也映照主角曾经没意识到珍贵的童年阶段。</w:t>
-      </w:r>
-    </w:p>
-    <w:p>
-      <w:pPr>
-        <w:pStyle w:val="ListBullet"/>
-      </w:pPr>
-      <w:r>
-        <w:t>• 奶奶：整条视频的情感核心，她的日常、做饭、唠叨和认出主角，构成主角全部思念与亏欠的落点。</w:t>
-      </w:r>
-    </w:p>
-    <w:p>
-      <w:pPr>
-        <w:pStyle w:val="Heading1"/>
-      </w:pPr>
-      <w:r>
-        <w:t>【教育意义/文化价值】</w:t>
-      </w:r>
-    </w:p>
-    <w:p>
-      <w:pPr>
-        <w:pStyle w:val="ListBullet"/>
-      </w:pPr>
-      <w:r>
-        <w:t>• 提醒观众：很多亲情不是没有爱，而是爱总在失去后才学会表达。</w:t>
-      </w:r>
-    </w:p>
-    <w:p>
-      <w:pPr>
-        <w:pStyle w:val="ListBullet"/>
-      </w:pPr>
-      <w:r>
-        <w:t>• 把“孝顺”从抽象口号落到非常具体的动作上，比如陪吃饭、给钱、提醒体检、常回家看看。</w:t>
-      </w:r>
-    </w:p>
-    <w:p>
-      <w:pPr>
-        <w:pStyle w:val="ListBullet"/>
-      </w:pPr>
-      <w:r>
-        <w:t>• 乡村旧宅、小卖部、饭桌和奶奶家常菜这些元素，强化了中国家庭记忆中最容易引发共鸣的文化现场。</w:t>
-      </w:r>
-    </w:p>
-    <w:p>
-      <w:pPr>
-        <w:pStyle w:val="Heading1"/>
-      </w:pPr>
-      <w:r>
-        <w:t>【核心爆点】</w:t>
-      </w:r>
-    </w:p>
-    <w:p>
-      <w:pPr>
-        <w:pStyle w:val="ListBullet"/>
-      </w:pPr>
-      <w:r>
-        <w:t>• 幻想设定包裹真实遗憾：它先用“穿越”降低观众进入门槛，让人以为是奇遇故事，后面再把所有细节一点点收束到“想再见奶奶一面”的真实情绪。</w:t>
-      </w:r>
-    </w:p>
-    <w:p>
-      <w:pPr>
-        <w:pStyle w:val="ListBullet"/>
-      </w:pPr>
-      <w:r>
-        <w:t>• 日常动作比大事件更伤人：真正打动人的不是宏大告白，而是买零食、催体检、夹菜、塞钱这种现实里最常来不及做好的小动作。</w:t>
-      </w:r>
-    </w:p>
-    <w:p>
-      <w:pPr>
-        <w:pStyle w:val="ListBullet"/>
-      </w:pPr>
-      <w:r>
-        <w:t>• 情绪递进非常稳：前段是好奇和轻松，中段变成温暖陪伴，后段忽然压到失去和亏欠，观众会在最后一句被整体反噬。</w:t>
-      </w:r>
-    </w:p>
-    <w:p>
-      <w:pPr>
-        <w:pStyle w:val="ListBullet"/>
-      </w:pPr>
-      <w:r>
-        <w:t>• 农村旧宅与奶奶饭菜是高识别记忆点：乡间土路、小卖部、旧砖房、家常菜这些具体物象，把“怀念亲人”从抽象情绪落成了可被复刻的记忆现场。</w:t>
-      </w:r>
-    </w:p>
-    <w:p>
-      <w:pPr>
-        <w:pStyle w:val="Heading1"/>
-      </w:pPr>
-      <w:r>
-        <w:t>【可替换部分】</w:t>
-      </w:r>
-    </w:p>
-    <w:p>
-      <w:pPr>
-        <w:pStyle w:val="ListBullet"/>
-      </w:pPr>
-      <w:r>
-        <w:t>• 亲人对象：奶奶可替换为爷爷、外婆、外公、已离开的父母或童年照顾者，但核心仍是“失去后才来得及表达爱”。</w:t>
-      </w:r>
-    </w:p>
-    <w:p>
-      <w:pPr>
-        <w:pStyle w:val="ListBullet"/>
-      </w:pPr>
-      <w:r>
-        <w:t>• 补偿动作：买零食、做饭、给钱、提醒体检，可替换为陪看病、修家电、拍合照、送衣服、陪赶集等同类迟到关心。</w:t>
-      </w:r>
-    </w:p>
-    <w:p>
-      <w:pPr>
-        <w:pStyle w:val="ListBullet"/>
-      </w:pPr>
-      <w:r>
-        <w:t>• 时空入口：原片是路边醒来和穿越台词，也可换成老屋、旧照片、电话、梦境、回乡下车等入口。</w:t>
-      </w:r>
-    </w:p>
-    <w:p>
-      <w:pPr>
-        <w:pStyle w:val="ListBullet"/>
-      </w:pPr>
-      <w:r>
-        <w:t>• 情绪落点：原片落在“欠你太多”，也可改成“还没带你出去看看”“还没赚到钱孝顺你”“还没学会好好说话”。</w:t>
-      </w:r>
-    </w:p>
-    <w:p>
-      <w:pPr>
-        <w:pStyle w:val="Heading1"/>
-      </w:pPr>
-      <w:r>
         <w:t>【技术参数】</w:t>
       </w:r>
-    </w:p>
-    <w:p>
       <w:r>
-        <w:t>时长：约 163 秒</w:t>
+        <w:br/>
       </w:r>
-    </w:p>
-    <w:p>
       <w:r>
-        <w:t>场景：乡间土路 / 小卖部 / 农村旧宅 / 饭桌 / 结尾空镜</w:t>
+        <w:t>时长：约 2 分 42 秒</w:t>
       </w:r>
-    </w:p>
-    <w:p>
       <w:r>
-        <w:t>人物关系：主角与奶奶的跨时空重逢</w:t>
+        <w:br/>
       </w:r>
-    </w:p>
-    <w:p>
       <w:r>
-        <w:t>情感节奏：好奇 -&gt; 轻松 -&gt; 温暖 -&gt; 补偿 -&gt; 失去与亏欠</w:t>
+        <w:t>场景：乡间土路 / 小卖部 / 旧宅院落 / 饭桌 / 尾声空镜</w:t>
       </w:r>
-    </w:p>
-    <w:p>
       <w:r>
-        <w:t>改编方向：可扩展为“如果还能再见亲人一次”系列亲情短剧</w:t>
+        <w:br/>
       </w:r>
-    </w:p>
-    <w:p>
+      <w:r>
+        <w:t>人物关系：成年孙子与奶奶的跨时空重逢</w:t>
+      </w:r>
+      <w:r>
+        <w:br/>
+      </w:r>
+      <w:r>
+        <w:t>情感节奏：错位惊醒 -&gt; 试探相认 -&gt; 童年愿望实现 -&gt; 家庭重逢 -&gt; 补偿式关心 -&gt; 失去明牌</w:t>
+      </w:r>
+      <w:r>
+        <w:br/>
+      </w:r>
       <w:r>
         <w:t>源链接：https://v.douyin.com/7qlycWsVNnw/</w:t>
       </w:r>
     </w:p>
     <w:p>
-      <w:pPr>
-        <w:pStyle w:val="Heading1"/>
-      </w:pPr>
       <w:r>
-        <w:t>【机制参考】</w:t>
+        <w:t>生成时间：2026-06-16</w:t>
       </w:r>
-    </w:p>
-    <w:p>
       <w:r>
-        <w:t>铺垫：开头用“醒醒”“这不是小时候的我吗”把观众带进穿回旧时农村的设定。</w:t>
+        <w:br/>
       </w:r>
-    </w:p>
-    <w:p>
       <w:r>
-        <w:t>违和点：主角明明像个外来大人，却对小孩想吃什么、奶奶做饭的味道、奶奶身体情况都熟得过分。</w:t>
-      </w:r>
-    </w:p>
-    <w:p>
-      <w:r>
-        <w:t>反转点：前半段像奇遇和童趣，中后段逐渐揭示这不是冒险，而是一次迟到的探望和补偿。</w:t>
-      </w:r>
-    </w:p>
-    <w:p>
-      <w:r>
-        <w:t>情绪落点：结尾空房与照片把前面的热闹全部压回现实，“我欠你太多”让情绪从温暖直接落到亏欠。</w:t>
-      </w:r>
-    </w:p>
-    <w:p>
-      <w:r>
-        <w:t>深层原因：视频真正成立的原因是“亲人离开后才学会怎么爱”的普遍遗憾：人不是想回到童年，而是想回到那个还来得及表达关心的时间点。</w:t>
-      </w:r>
-    </w:p>
-    <w:p/>
-    <w:p>
-      <w:r>
-        <w:t>生成时间：2026-06-16 21:35:12</w:t>
-      </w:r>
-    </w:p>
-    <w:p>
-      <w:r>
-        <w:t>生成方式：基于 v3 fallback-frame-analysis 重建脚本</w:t>
+        <w:t>生成方式：强化对白密度版复制脚本</w:t>
       </w:r>
     </w:p>
     <w:sectPr>
@@ -869,8 +1130,8 @@
     <w:qFormat/>
     <w:rsid w:val="00FC693F"/>
     <w:rPr>
-      <w:rFonts w:ascii="Microsoft YaHei" w:hAnsi="Microsoft YaHei"/>
-      <w:sz w:val="24"/>
+      <w:rFonts w:ascii="PingFang SC" w:hAnsi="PingFang SC"/>
+      <w:sz w:val="22"/>
     </w:rPr>
   </w:style>
   <w:style w:type="paragraph" w:styleId="Header">

</xml_diff>